<commit_message>
fix: update erd symbol
</commit_message>
<xml_diff>
--- a/basis-data-stsi4105/Laporan Tugas 1 Basis Data (STSI4105).docx
+++ b/basis-data-stsi4105/Laporan Tugas 1 Basis Data (STSI4105).docx
@@ -328,7 +328,16 @@
         <w:t xml:space="preserve">• </w:t>
       </w:r>
       <w:r>
-        <w:t xml:space="preserve">ERD konseptual digambar dengan yEd Graph Editor (entitas, relasi, kardinalitas, dan atribut relasi).</w:t>
+        <w:t xml:space="preserve">ERD konseptual digambar dengan notasi Chen di draw.io (file </w:t>
+      </w:r>
+      <w:r>
+        <w:rPr>
+          <w:rFonts w:ascii="Courier New" w:hAnsi="Courier New" w:cs="Courier New"/>
+        </w:rPr>
+        <w:t xml:space="preserve">erd-chen.drawio</w:t>
+      </w:r>
+      <w:r>
+        <w:t xml:space="preserve">): persegi panjang = entitas, belah ketupat = relasi, elips = atribut, atribut kunci (primary key) digarisbawahi, dan setiap garis relasi diberi kardinalitas (1, N, M). Di bawah diagram ada tabel keterangan derajat relasi dan kardinalitas.</w:t>
       </w:r>
     </w:p>
     <w:p>
@@ -359,7 +368,7 @@
         <w:rPr>
           <w:b/>
         </w:rPr>
-        <w:t xml:space="preserve">ERD konseptual (yEd)</w:t>
+        <w:t xml:space="preserve">ERD konseptual (notasi Chen, draw.io)</w:t>
       </w:r>
     </w:p>
     <w:p>
@@ -370,13 +379,13 @@
       <w:r>
         <w:drawing>
           <wp:inline>
-            <wp:extent cx="3438525" cy="5953125"/>
-            <wp:docPr id="1001" name="erd-tugas-1.png"/>
+            <wp:extent cx="5580000" cy="3479294"/>
+            <wp:docPr id="1001" name="erd-chen.png"/>
             <a:graphic xmlns:a="http://schemas.openxmlformats.org/drawingml/2006/main">
               <a:graphicData uri="http://schemas.openxmlformats.org/drawingml/2006/picture">
                 <pic:pic xmlns:pic="http://schemas.openxmlformats.org/drawingml/2006/picture">
                   <pic:nvPicPr>
-                    <pic:cNvPr id="1001" name="erd-tugas-1.png"/>
+                    <pic:cNvPr id="1001" name="erd-chen.png"/>
                     <pic:cNvPicPr/>
                   </pic:nvPicPr>
                   <pic:blipFill>
@@ -388,7 +397,7 @@
                   <pic:spPr>
                     <a:xfrm>
                       <a:off x="0" y="0"/>
-                      <a:ext cx="3438525" cy="5953125"/>
+                      <a:ext cx="5580000" cy="3479294"/>
                     </a:xfrm>
                     <a:prstGeom prst="rect">
                       <a:avLst/>
@@ -1681,7 +1690,15 @@
         <w:rPr>
           <w:b/>
         </w:rPr>
-        <w:t xml:space="preserve">Langkah 4 Relasi dan kardinalitas (ERD konseptual)</w:t>
+        <w:t xml:space="preserve">Langkah 4 Derajat relasi dan kardinalitas (ERD konseptual)</w:t>
+      </w:r>
+    </w:p>
+    <w:p>
+      <w:pPr>
+        <w:spacing w:after="120"/>
+      </w:pPr>
+      <w:r>
+        <w:t xml:space="preserve">Derajat relasi adalah jumlah entitas yang terlibat dalam satu relasi (unary = 1, biner = 2, ternary = 3). Kardinalitas adalah jumlah maksimum anggota entitas yang bisa berelasi dengan anggota entitas lain (1:1, 1:N, atau M:N). Semua relasi pada kasus ini menghubungkan dua entitas, jadi derajatnya biner.</w:t>
       </w:r>
     </w:p>
     <w:tbl>
@@ -1735,6 +1752,20 @@
               <w:rPr>
                 <w:b/>
               </w:rPr>
+              <w:t xml:space="preserve">Derajat</w:t>
+            </w:r>
+          </w:p>
+        </w:tc>
+        <w:tc>
+          <w:tcPr/>
+          <w:p>
+            <w:pPr>
+              <w:spacing w:after="0"/>
+            </w:pPr>
+            <w:r>
+              <w:rPr>
+                <w:b/>
+              </w:rPr>
               <w:t xml:space="preserve">Kardinalitas</w:t>
             </w:r>
           </w:p>
@@ -1784,6 +1815,17 @@
               <w:spacing w:after="0"/>
             </w:pPr>
             <w:r>
+              <w:t xml:space="preserve">Biner</w:t>
+            </w:r>
+          </w:p>
+        </w:tc>
+        <w:tc>
+          <w:tcPr/>
+          <w:p>
+            <w:pPr>
+              <w:spacing w:after="0"/>
+            </w:pPr>
+            <w:r>
               <w:t xml:space="preserve">1 : N</w:t>
             </w:r>
           </w:p>
@@ -1830,6 +1872,17 @@
               <w:spacing w:after="0"/>
             </w:pPr>
             <w:r>
+              <w:t xml:space="preserve">Biner</w:t>
+            </w:r>
+          </w:p>
+        </w:tc>
+        <w:tc>
+          <w:tcPr/>
+          <w:p>
+            <w:pPr>
+              <w:spacing w:after="0"/>
+            </w:pPr>
+            <w:r>
               <w:t xml:space="preserve">M : N</w:t>
             </w:r>
           </w:p>
@@ -1876,6 +1929,17 @@
               <w:spacing w:after="0"/>
             </w:pPr>
             <w:r>
+              <w:t xml:space="preserve">Biner</w:t>
+            </w:r>
+          </w:p>
+        </w:tc>
+        <w:tc>
+          <w:tcPr/>
+          <w:p>
+            <w:pPr>
+              <w:spacing w:after="0"/>
+            </w:pPr>
+            <w:r>
               <w:t xml:space="preserve">1 : N</w:t>
             </w:r>
           </w:p>
@@ -1922,6 +1986,17 @@
               <w:spacing w:after="0"/>
             </w:pPr>
             <w:r>
+              <w:t xml:space="preserve">Biner</w:t>
+            </w:r>
+          </w:p>
+        </w:tc>
+        <w:tc>
+          <w:tcPr/>
+          <w:p>
+            <w:pPr>
+              <w:spacing w:after="0"/>
+            </w:pPr>
+            <w:r>
               <w:t xml:space="preserve">1 : N</w:t>
             </w:r>
           </w:p>
@@ -1958,6 +2033,17 @@
             </w:pPr>
             <w:r>
               <w:t xml:space="preserve">Resep - Obat</w:t>
+            </w:r>
+          </w:p>
+        </w:tc>
+        <w:tc>
+          <w:tcPr/>
+          <w:p>
+            <w:pPr>
+              <w:spacing w:after="0"/>
+            </w:pPr>
+            <w:r>
+              <w:t xml:space="preserve">Biner</w:t>
             </w:r>
           </w:p>
         </w:tc>
@@ -2496,7 +2582,7 @@
         <w:rPr>
           <w:color w:val="EE0000"/>
         </w:rPr>
-        <w:t xml:space="preserve">Catatan (hapus setelah dicek): video wajib menampilkan wajah; di awal sebutkan Nama, NIM, Program studi (Sistem Informasi), dan Mata kuliah Basis Data (STSI4105); jelaskan tujuan praktikum, tunjukkan proses menggambar ERD di yEd secara langsung, jelaskan hasil ERD dan kardinalitasnya, lalu penutup singkat. Pastikan link bisa dibuka tanpa minta izin akses.</w:t>
+        <w:t xml:space="preserve">Catatan (hapus setelah dicek): video wajib menampilkan wajah; di awal sebutkan Nama, NIM, Program studi (Sistem Informasi), dan Mata kuliah Basis Data (STSI4105); jelaskan tujuan praktikum, tunjukkan proses menggambar ERD di draw.io secara langsung, jelaskan hasil ERD dan kardinalitasnya, lalu penutup singkat. Pastikan link bisa dibuka tanpa minta izin akses.</w:t>
       </w:r>
     </w:p>
     <w:p>
@@ -2528,7 +2614,7 @@
         <w:rPr>
           <w:color w:val="EE0000"/>
         </w:rPr>
-        <w:t xml:space="preserve">Simpan foto selfie bersama layar yEd yang menampilkan ERD sebagai basis-data-stsi4105/swafoto-layar-program.png lalu generate ulang, atau tempel langsung di Word.</w:t>
+        <w:t xml:space="preserve">Simpan foto selfie bersama layar draw.io yang menampilkan ERD sebagai basis-data-stsi4105/swafoto-layar-program.png lalu generate ulang, atau tempel langsung di Word.</w:t>
       </w:r>
     </w:p>
     <w:p>
@@ -2604,6 +2690,23 @@
         <w:spacing w:after="120"/>
       </w:pPr>
       <w:r>
+        <w:t xml:space="preserve">JGraph Ltd. (n.d.). </w:t>
+      </w:r>
+      <w:r>
+        <w:rPr>
+          <w:i/>
+        </w:rPr>
+        <w:t xml:space="preserve">draw.io</w:t>
+      </w:r>
+      <w:r>
+        <w:t xml:space="preserve"> [Computer software]. https://www.drawio.com</w:t>
+      </w:r>
+    </w:p>
+    <w:p>
+      <w:pPr>
+        <w:spacing w:after="120"/>
+      </w:pPr>
+      <w:r>
         <w:t xml:space="preserve">Mermaid. (n.d.). </w:t>
       </w:r>
       <w:r>
@@ -2614,23 +2717,6 @@
       </w:r>
       <w:r>
         <w:t xml:space="preserve">. https://mermaid.js.org/syntax/entityRelationshipDiagram.html</w:t>
-      </w:r>
-    </w:p>
-    <w:p>
-      <w:pPr>
-        <w:spacing w:after="120"/>
-      </w:pPr>
-      <w:r>
-        <w:t xml:space="preserve">yWorks GmbH. (n.d.). </w:t>
-      </w:r>
-      <w:r>
-        <w:rPr>
-          <w:i/>
-        </w:rPr>
-        <w:t xml:space="preserve">yEd graph editor</w:t>
-      </w:r>
-      <w:r>
-        <w:t xml:space="preserve"> [Computer software]. https://www.yworks.com/products/yed</w:t>
       </w:r>
     </w:p>
     <w:sectPr>

</xml_diff>